<commit_message>
Replace bundled question bank
</commit_message>
<xml_diff>
--- a/docs/exam_sources/question_bank/物资岗位规范考核题库.docx
+++ b/docs/exam_sources/question_bank/物资岗位规范考核题库.docx
@@ -1105,6 +1105,10 @@
         <w:spacing w:before="120" w:after="120" w:line="288" w:lineRule="auto"/>
         <w:ind w:left="0"/>
         <w:jc w:val="left"/>
+        <w:rPr>
+          <w:rFonts w:ascii="Arial" w:hAnsi="Arial" w:eastAsia="等线" w:cs="Arial"/>
+          <w:sz w:val="22"/>
+        </w:rPr>
       </w:pPr>
       <w:r>
         <w:rPr>
@@ -1155,6 +1159,22 @@
         </w:rPr>
         <w:t>D. 交易双方私下手写白条</w:t>
       </w:r>
+    </w:p>
+    <w:p>
+      <w:pPr>
+        <w:spacing w:before="120" w:after="120" w:line="288" w:lineRule="auto"/>
+        <w:ind w:left="0"/>
+        <w:jc w:val="left"/>
+      </w:pPr>
+      <w:r>
+        <w:rPr>
+          <w:rFonts w:hint="eastAsia" w:ascii="Arial" w:hAnsi="Arial" w:eastAsia="等线" w:cs="Arial"/>
+          <w:color w:val="0000FF"/>
+          <w:sz w:val="22"/>
+          <w:lang w:val="en-US" w:eastAsia="zh-CN"/>
+        </w:rPr>
+        <w:t>E.其他单位抬头单据</w:t>
+      </w:r>
       <w:r>
         <w:rPr>
           <w:rFonts w:ascii="Arial" w:hAnsi="Arial" w:eastAsia="等线" w:cs="Arial"/>
@@ -1182,7 +1202,30 @@
           <w:rFonts w:ascii="Arial" w:hAnsi="Arial" w:eastAsia="等线" w:cs="Arial"/>
           <w:sz w:val="22"/>
         </w:rPr>
-        <w:t>解析：进场入库验收第③条：收集并移交送货单、合格证、质保书等原始随货资料；私下白条不属于合规核验凭证，禁止纳入验收依据。</w:t>
+        <w:t>解析：进场入库验收第③条：收集并移交送货单、合格证、质保书等原始随货资料；私下白条不属于合规核验凭证，禁止纳入验收依据</w:t>
+      </w:r>
+      <w:r>
+        <w:rPr>
+          <w:rFonts w:hint="eastAsia" w:ascii="Arial" w:hAnsi="Arial" w:eastAsia="等线" w:cs="Arial"/>
+          <w:sz w:val="22"/>
+          <w:lang w:eastAsia="zh-CN"/>
+        </w:rPr>
+        <w:t>；</w:t>
+      </w:r>
+      <w:r>
+        <w:rPr>
+          <w:rFonts w:hint="eastAsia" w:ascii="Arial" w:hAnsi="Arial" w:eastAsia="等线" w:cs="Arial"/>
+          <w:sz w:val="22"/>
+          <w:lang w:val="en-US" w:eastAsia="zh-CN"/>
+        </w:rPr>
+        <w:t>与合同单位不符的单据不可纳入验收依据，除非合同内有说明</w:t>
+      </w:r>
+      <w:r>
+        <w:rPr>
+          <w:rFonts w:ascii="Arial" w:hAnsi="Arial" w:eastAsia="等线" w:cs="Arial"/>
+          <w:sz w:val="22"/>
+        </w:rPr>
+        <w:t>。</w:t>
       </w:r>
     </w:p>
     <w:p>
@@ -1208,6 +1251,10 @@
         <w:spacing w:before="120" w:after="120" w:line="288" w:lineRule="auto"/>
         <w:ind w:left="0"/>
         <w:jc w:val="left"/>
+        <w:rPr>
+          <w:rFonts w:ascii="Arial" w:hAnsi="Arial" w:eastAsia="等线" w:cs="Arial"/>
+          <w:sz w:val="22"/>
+        </w:rPr>
       </w:pPr>
       <w:r>
         <w:rPr>
@@ -1258,6 +1305,22 @@
         </w:rPr>
         <w:t>D. 缺陷材料可直接私自挪用进场使用</w:t>
       </w:r>
+    </w:p>
+    <w:p>
+      <w:pPr>
+        <w:spacing w:before="120" w:after="120" w:line="288" w:lineRule="auto"/>
+        <w:ind w:left="0"/>
+        <w:jc w:val="left"/>
+      </w:pPr>
+      <w:r>
+        <w:rPr>
+          <w:rFonts w:hint="eastAsia" w:ascii="Arial" w:hAnsi="Arial" w:eastAsia="等线" w:cs="Arial"/>
+          <w:color w:val="0000FF"/>
+          <w:sz w:val="22"/>
+          <w:lang w:val="en-US" w:eastAsia="zh-CN"/>
+        </w:rPr>
+        <w:t>E.无视直接验收</w:t>
+      </w:r>
       <w:r>
         <w:rPr>
           <w:rFonts w:ascii="Arial" w:hAnsi="Arial" w:eastAsia="等线" w:cs="Arial"/>
@@ -1285,7 +1348,22 @@
           <w:rFonts w:ascii="Arial" w:hAnsi="Arial" w:eastAsia="等线" w:cs="Arial"/>
           <w:sz w:val="22"/>
         </w:rPr>
-        <w:t>解析：不合格材料退货处理三条规范对应 ABC；D 违背规则，严禁问题材料违规进场使用。</w:t>
+        <w:t>解析：不合格材料退货处理三条规范对应 ABC；D</w:t>
+      </w:r>
+      <w:r>
+        <w:rPr>
+          <w:rFonts w:hint="eastAsia" w:ascii="Arial" w:hAnsi="Arial" w:eastAsia="等线" w:cs="Arial"/>
+          <w:sz w:val="22"/>
+          <w:lang w:val="en-US" w:eastAsia="zh-CN"/>
+        </w:rPr>
+        <w:t>E</w:t>
+      </w:r>
+      <w:r>
+        <w:rPr>
+          <w:rFonts w:ascii="Arial" w:hAnsi="Arial" w:eastAsia="等线" w:cs="Arial"/>
+          <w:sz w:val="22"/>
+        </w:rPr>
+        <w:t xml:space="preserve"> 违背规则，严禁问题材料违规进场使用。</w:t>
       </w:r>
     </w:p>
     <w:p>
@@ -1311,6 +1389,10 @@
         <w:spacing w:before="120" w:after="120" w:line="288" w:lineRule="auto"/>
         <w:ind w:left="0"/>
         <w:jc w:val="left"/>
+        <w:rPr>
+          <w:rFonts w:ascii="Arial" w:hAnsi="Arial" w:eastAsia="等线" w:cs="Arial"/>
+          <w:sz w:val="22"/>
+        </w:rPr>
       </w:pPr>
       <w:r>
         <w:rPr>
@@ -1361,6 +1443,22 @@
         </w:rPr>
         <w:t>D. 夜间直接封闭大门，不开展安保值守</w:t>
       </w:r>
+    </w:p>
+    <w:p>
+      <w:pPr>
+        <w:spacing w:before="120" w:after="120" w:line="288" w:lineRule="auto"/>
+        <w:ind w:left="0"/>
+        <w:jc w:val="left"/>
+      </w:pPr>
+      <w:r>
+        <w:rPr>
+          <w:rFonts w:hint="eastAsia" w:ascii="Arial" w:hAnsi="Arial" w:eastAsia="等线" w:cs="Arial"/>
+          <w:color w:val="0000FF"/>
+          <w:sz w:val="22"/>
+          <w:lang w:val="en-US" w:eastAsia="zh-CN"/>
+        </w:rPr>
+        <w:t>E.夜间擅自离岗多时</w:t>
+      </w:r>
       <w:r>
         <w:rPr>
           <w:rFonts w:ascii="Arial" w:hAnsi="Arial" w:eastAsia="等线" w:cs="Arial"/>
@@ -1388,7 +1486,22 @@
           <w:rFonts w:ascii="Arial" w:hAnsi="Arial" w:eastAsia="等线" w:cs="Arial"/>
           <w:sz w:val="22"/>
         </w:rPr>
-        <w:t>解析：门禁管理规范明确 A、B、C 三项要求；第⑤条要求门卫夜间保持警惕值守，D 错误。</w:t>
+        <w:t>解析：门禁管理规范明确 A、B、C 三项要求；第⑤条要求门卫夜间保持警惕值守，D</w:t>
+      </w:r>
+      <w:r>
+        <w:rPr>
+          <w:rFonts w:hint="eastAsia" w:ascii="Arial" w:hAnsi="Arial" w:eastAsia="等线" w:cs="Arial"/>
+          <w:sz w:val="22"/>
+          <w:lang w:val="en-US" w:eastAsia="zh-CN"/>
+        </w:rPr>
+        <w:t>E</w:t>
+      </w:r>
+      <w:r>
+        <w:rPr>
+          <w:rFonts w:ascii="Arial" w:hAnsi="Arial" w:eastAsia="等线" w:cs="Arial"/>
+          <w:sz w:val="22"/>
+        </w:rPr>
+        <w:t xml:space="preserve"> 错误。</w:t>
       </w:r>
     </w:p>
     <w:p>
@@ -1414,6 +1527,10 @@
         <w:spacing w:before="120" w:after="120" w:line="288" w:lineRule="auto"/>
         <w:ind w:left="0"/>
         <w:jc w:val="left"/>
+        <w:rPr>
+          <w:rFonts w:ascii="Arial" w:hAnsi="Arial" w:eastAsia="等线" w:cs="Arial"/>
+          <w:sz w:val="22"/>
+        </w:rPr>
       </w:pPr>
       <w:r>
         <w:rPr>
@@ -1464,6 +1581,22 @@
         </w:rPr>
         <w:t>D. 熟悉应急预案，险情按流程开展处置</w:t>
       </w:r>
+    </w:p>
+    <w:p>
+      <w:pPr>
+        <w:spacing w:before="120" w:after="120" w:line="288" w:lineRule="auto"/>
+        <w:ind w:left="0"/>
+        <w:jc w:val="left"/>
+      </w:pPr>
+      <w:r>
+        <w:rPr>
+          <w:rFonts w:hint="eastAsia" w:ascii="Arial" w:hAnsi="Arial" w:eastAsia="等线" w:cs="Arial"/>
+          <w:color w:val="0000FF"/>
+          <w:sz w:val="22"/>
+          <w:lang w:val="en-US" w:eastAsia="zh-CN"/>
+        </w:rPr>
+        <w:t>E.有丢失、损害无需上报</w:t>
+      </w:r>
       <w:r>
         <w:rPr>
           <w:rFonts w:ascii="Arial" w:hAnsi="Arial" w:eastAsia="等线" w:cs="Arial"/>
@@ -1491,7 +1624,30 @@
           <w:rFonts w:ascii="Arial" w:hAnsi="Arial" w:eastAsia="等线" w:cs="Arial"/>
           <w:sz w:val="22"/>
         </w:rPr>
-        <w:t>解析：物资巡查与安全①-⑤条，四项均为法定巡查、应急管控要求。</w:t>
+        <w:t>解析：物资巡查与安全①-⑤条，四项均为法定巡查、应急管控要求</w:t>
+      </w:r>
+      <w:r>
+        <w:rPr>
+          <w:rFonts w:hint="eastAsia" w:ascii="Arial" w:hAnsi="Arial" w:eastAsia="等线" w:cs="Arial"/>
+          <w:sz w:val="22"/>
+          <w:lang w:eastAsia="zh-CN"/>
+        </w:rPr>
+        <w:t>；</w:t>
+      </w:r>
+      <w:r>
+        <w:rPr>
+          <w:rFonts w:hint="eastAsia" w:ascii="Arial" w:hAnsi="Arial" w:eastAsia="等线" w:cs="Arial"/>
+          <w:sz w:val="22"/>
+          <w:lang w:val="en-US" w:eastAsia="zh-CN"/>
+        </w:rPr>
+        <w:t>E为不负责行为</w:t>
+      </w:r>
+      <w:r>
+        <w:rPr>
+          <w:rFonts w:ascii="Arial" w:hAnsi="Arial" w:eastAsia="等线" w:cs="Arial"/>
+          <w:sz w:val="22"/>
+        </w:rPr>
+        <w:t>。</w:t>
       </w:r>
     </w:p>
     <w:p>
@@ -1517,6 +1673,10 @@
         <w:spacing w:before="120" w:after="120" w:line="288" w:lineRule="auto"/>
         <w:ind w:left="0"/>
         <w:jc w:val="left"/>
+        <w:rPr>
+          <w:rFonts w:ascii="Arial" w:hAnsi="Arial" w:eastAsia="等线" w:cs="Arial"/>
+          <w:sz w:val="22"/>
+        </w:rPr>
       </w:pPr>
       <w:r>
         <w:rPr>
@@ -1567,6 +1727,39 @@
         </w:rPr>
         <w:t>D. 盘点出现盈亏直接自行调账，不用签字</w:t>
       </w:r>
+    </w:p>
+    <w:p>
+      <w:pPr>
+        <w:spacing w:before="120" w:after="120" w:line="288" w:lineRule="auto"/>
+        <w:ind w:left="0"/>
+        <w:jc w:val="left"/>
+      </w:pPr>
+      <w:r>
+        <w:rPr>
+          <w:rFonts w:hint="eastAsia" w:ascii="Arial" w:hAnsi="Arial" w:eastAsia="等线" w:cs="Arial"/>
+          <w:color w:val="0000FF"/>
+          <w:sz w:val="22"/>
+          <w:lang w:val="en-US" w:eastAsia="zh-CN"/>
+        </w:rPr>
+        <w:t>E.</w:t>
+      </w:r>
+      <w:r>
+        <w:rPr>
+          <w:rFonts w:ascii="Arial" w:hAnsi="Arial" w:eastAsia="等线" w:cs="Arial"/>
+          <w:color w:val="0000FF"/>
+          <w:sz w:val="22"/>
+        </w:rPr>
+        <w:t>盘点出现盈亏</w:t>
+      </w:r>
+      <w:r>
+        <w:rPr>
+          <w:rFonts w:hint="eastAsia" w:ascii="Arial" w:hAnsi="Arial" w:eastAsia="等线" w:cs="Arial"/>
+          <w:color w:val="0000FF"/>
+          <w:sz w:val="22"/>
+          <w:lang w:val="en-US" w:eastAsia="zh-CN"/>
+        </w:rPr>
+        <w:t>不做任何处理</w:t>
+      </w:r>
       <w:r>
         <w:rPr>
           <w:rFonts w:ascii="Arial" w:hAnsi="Arial" w:eastAsia="等线" w:cs="Arial"/>
@@ -1594,7 +1787,22 @@
           <w:rFonts w:ascii="Arial" w:hAnsi="Arial" w:eastAsia="等线" w:cs="Arial"/>
           <w:sz w:val="22"/>
         </w:rPr>
-        <w:t>解析：盘点规范要求盈亏必须责任人签字、复盘分析，D 违规不可执行。</w:t>
+        <w:t xml:space="preserve">解析：盘点规范要求盈亏必须责任人签字、复盘分析，D </w:t>
+      </w:r>
+      <w:r>
+        <w:rPr>
+          <w:rFonts w:hint="eastAsia" w:ascii="Arial" w:hAnsi="Arial" w:eastAsia="等线" w:cs="Arial"/>
+          <w:sz w:val="22"/>
+          <w:lang w:val="en-US" w:eastAsia="zh-CN"/>
+        </w:rPr>
+        <w:t>E</w:t>
+      </w:r>
+      <w:r>
+        <w:rPr>
+          <w:rFonts w:ascii="Arial" w:hAnsi="Arial" w:eastAsia="等线" w:cs="Arial"/>
+          <w:sz w:val="22"/>
+        </w:rPr>
+        <w:t>违规不可执行。</w:t>
       </w:r>
     </w:p>
     <w:p>
@@ -1620,6 +1828,10 @@
         <w:spacing w:before="120" w:after="120" w:line="288" w:lineRule="auto"/>
         <w:ind w:left="0"/>
         <w:jc w:val="left"/>
+        <w:rPr>
+          <w:rFonts w:ascii="Arial" w:hAnsi="Arial" w:eastAsia="等线" w:cs="Arial"/>
+          <w:sz w:val="22"/>
+        </w:rPr>
       </w:pPr>
       <w:r>
         <w:rPr>
@@ -1670,6 +1882,22 @@
         </w:rPr>
         <w:t>D. 按月核对部门废旧物资处置台账</w:t>
       </w:r>
+    </w:p>
+    <w:p>
+      <w:pPr>
+        <w:spacing w:before="120" w:after="120" w:line="288" w:lineRule="auto"/>
+        <w:ind w:left="0"/>
+        <w:jc w:val="left"/>
+      </w:pPr>
+      <w:r>
+        <w:rPr>
+          <w:rFonts w:hint="eastAsia" w:ascii="Arial" w:hAnsi="Arial" w:eastAsia="等线" w:cs="Arial"/>
+          <w:color w:val="0000FF"/>
+          <w:sz w:val="22"/>
+          <w:lang w:val="en-US" w:eastAsia="zh-CN"/>
+        </w:rPr>
+        <w:t>E.未经审核私自处理</w:t>
+      </w:r>
       <w:r>
         <w:rPr>
           <w:rFonts w:ascii="Arial" w:hAnsi="Arial" w:eastAsia="等线" w:cs="Arial"/>
@@ -1697,7 +1925,30 @@
           <w:rFonts w:ascii="Arial" w:hAnsi="Arial" w:eastAsia="等线" w:cs="Arial"/>
           <w:sz w:val="22"/>
         </w:rPr>
-        <w:t>解析：废旧处置管理 4 条细则，四项内容全部符合规范。</w:t>
+        <w:t>解析：废旧处置管理 4 条细则，四项内容全部符合规范</w:t>
+      </w:r>
+      <w:r>
+        <w:rPr>
+          <w:rFonts w:hint="eastAsia" w:ascii="Arial" w:hAnsi="Arial" w:eastAsia="等线" w:cs="Arial"/>
+          <w:sz w:val="22"/>
+          <w:lang w:eastAsia="zh-CN"/>
+        </w:rPr>
+        <w:t>；</w:t>
+      </w:r>
+      <w:r>
+        <w:rPr>
+          <w:rFonts w:hint="eastAsia" w:ascii="Arial" w:hAnsi="Arial" w:eastAsia="等线" w:cs="Arial"/>
+          <w:sz w:val="22"/>
+          <w:lang w:val="en-US" w:eastAsia="zh-CN"/>
+        </w:rPr>
+        <w:t>E为红线</w:t>
+      </w:r>
+      <w:r>
+        <w:rPr>
+          <w:rFonts w:ascii="Arial" w:hAnsi="Arial" w:eastAsia="等线" w:cs="Arial"/>
+          <w:sz w:val="22"/>
+        </w:rPr>
+        <w:t>。</w:t>
       </w:r>
     </w:p>
     <w:p>
@@ -1723,6 +1974,10 @@
         <w:spacing w:before="120" w:after="120" w:line="288" w:lineRule="auto"/>
         <w:ind w:left="0"/>
         <w:jc w:val="left"/>
+        <w:rPr>
+          <w:rFonts w:ascii="Arial" w:hAnsi="Arial" w:eastAsia="等线" w:cs="Arial"/>
+          <w:sz w:val="22"/>
+        </w:rPr>
       </w:pPr>
       <w:r>
         <w:rPr>
@@ -1773,6 +2028,22 @@
         </w:rPr>
         <w:t>D. 问题登记、留存索赔凭证</w:t>
       </w:r>
+    </w:p>
+    <w:p>
+      <w:pPr>
+        <w:spacing w:before="120" w:after="120" w:line="288" w:lineRule="auto"/>
+        <w:ind w:left="0"/>
+        <w:jc w:val="left"/>
+      </w:pPr>
+      <w:r>
+        <w:rPr>
+          <w:rFonts w:hint="eastAsia" w:ascii="Arial" w:hAnsi="Arial" w:eastAsia="等线" w:cs="Arial"/>
+          <w:color w:val="0000FF"/>
+          <w:sz w:val="22"/>
+          <w:lang w:val="en-US" w:eastAsia="zh-CN"/>
+        </w:rPr>
+        <w:t>E.按时供货</w:t>
+      </w:r>
       <w:r>
         <w:rPr>
           <w:rFonts w:ascii="Arial" w:hAnsi="Arial" w:eastAsia="等线" w:cs="Arial"/>
@@ -1800,7 +2071,30 @@
           <w:rFonts w:ascii="Arial" w:hAnsi="Arial" w:eastAsia="等线" w:cs="Arial"/>
           <w:sz w:val="22"/>
         </w:rPr>
-        <w:t>解析：供应商问题协调规范，供货时效、卸货费用、货品质量均需协调处置，全流程做台账、留存取证资料。</w:t>
+        <w:t>解析：供应商问题协调规范，供货时效、卸货费用、货品质量均需协调处置，全流程做台账、留存取证资料</w:t>
+      </w:r>
+      <w:r>
+        <w:rPr>
+          <w:rFonts w:hint="eastAsia" w:ascii="Arial" w:hAnsi="Arial" w:eastAsia="等线" w:cs="Arial"/>
+          <w:sz w:val="22"/>
+          <w:lang w:eastAsia="zh-CN"/>
+        </w:rPr>
+        <w:t>；</w:t>
+      </w:r>
+      <w:r>
+        <w:rPr>
+          <w:rFonts w:hint="eastAsia" w:ascii="Arial" w:hAnsi="Arial" w:eastAsia="等线" w:cs="Arial"/>
+          <w:sz w:val="22"/>
+          <w:lang w:val="en-US" w:eastAsia="zh-CN"/>
+        </w:rPr>
+        <w:t>E已按时无需处理</w:t>
+      </w:r>
+      <w:r>
+        <w:rPr>
+          <w:rFonts w:ascii="Arial" w:hAnsi="Arial" w:eastAsia="等线" w:cs="Arial"/>
+          <w:sz w:val="22"/>
+        </w:rPr>
+        <w:t>。</w:t>
       </w:r>
     </w:p>
     <w:p>
@@ -1826,6 +2120,10 @@
         <w:spacing w:before="120" w:after="120" w:line="288" w:lineRule="auto"/>
         <w:ind w:left="0"/>
         <w:jc w:val="left"/>
+        <w:rPr>
+          <w:rFonts w:ascii="Arial" w:hAnsi="Arial" w:eastAsia="等线" w:cs="Arial"/>
+          <w:sz w:val="22"/>
+        </w:rPr>
       </w:pPr>
       <w:r>
         <w:rPr>
@@ -1874,7 +2172,31 @@
           <w:rFonts w:ascii="Arial" w:hAnsi="Arial" w:eastAsia="等线" w:cs="Arial"/>
           <w:sz w:val="22"/>
         </w:rPr>
-        <w:t>D. 按月对账、配合财务做结算工作</w:t>
+        <w:t xml:space="preserve">D. </w:t>
+      </w:r>
+      <w:r>
+        <w:rPr>
+          <w:rFonts w:ascii="Arial" w:hAnsi="Arial" w:eastAsia="等线" w:cs="Arial"/>
+          <w:color w:val="0000FF"/>
+          <w:sz w:val="22"/>
+        </w:rPr>
+        <w:t>按月对账做结算工作</w:t>
+      </w:r>
+    </w:p>
+    <w:p>
+      <w:pPr>
+        <w:spacing w:before="120" w:after="120" w:line="288" w:lineRule="auto"/>
+        <w:ind w:left="0"/>
+        <w:jc w:val="left"/>
+      </w:pPr>
+      <w:r>
+        <w:rPr>
+          <w:rFonts w:hint="eastAsia" w:ascii="Arial" w:hAnsi="Arial" w:eastAsia="等线" w:cs="Arial"/>
+          <w:color w:val="0000FF"/>
+          <w:sz w:val="22"/>
+          <w:lang w:val="en-US" w:eastAsia="zh-CN"/>
+        </w:rPr>
+        <w:t>E.随意操作出库无签字、不拍照</w:t>
       </w:r>
       <w:r>
         <w:rPr>
@@ -1903,7 +2225,30 @@
           <w:rFonts w:ascii="Arial" w:hAnsi="Arial" w:eastAsia="等线" w:cs="Arial"/>
           <w:sz w:val="22"/>
         </w:rPr>
-        <w:t>解析：材料出库 4 条作业细则，四个选项全部匹配标准要求。</w:t>
+        <w:t>解析：材料出库 4 条作业细则，四个选项全部匹配标准要求</w:t>
+      </w:r>
+      <w:r>
+        <w:rPr>
+          <w:rFonts w:hint="eastAsia" w:ascii="Arial" w:hAnsi="Arial" w:eastAsia="等线" w:cs="Arial"/>
+          <w:sz w:val="22"/>
+          <w:lang w:eastAsia="zh-CN"/>
+        </w:rPr>
+        <w:t>；</w:t>
+      </w:r>
+      <w:r>
+        <w:rPr>
+          <w:rFonts w:hint="eastAsia" w:ascii="Arial" w:hAnsi="Arial" w:eastAsia="等线" w:cs="Arial"/>
+          <w:sz w:val="22"/>
+          <w:lang w:val="en-US" w:eastAsia="zh-CN"/>
+        </w:rPr>
+        <w:t>E不符合规范要求</w:t>
+      </w:r>
+      <w:r>
+        <w:rPr>
+          <w:rFonts w:ascii="Arial" w:hAnsi="Arial" w:eastAsia="等线" w:cs="Arial"/>
+          <w:sz w:val="22"/>
+        </w:rPr>
+        <w:t>。</w:t>
       </w:r>
     </w:p>
     <w:p>
@@ -1923,485 +2268,485 @@
         <w:t>三、判断题（10 道，√代表正确，× 代表错误）</w:t>
       </w:r>
       <w:bookmarkEnd w:id="20"/>
-    </w:p>
-    <w:p>
-      <w:pPr>
-        <w:spacing w:before="300" w:after="120" w:line="288" w:lineRule="auto"/>
-        <w:ind w:left="0"/>
-        <w:jc w:val="left"/>
-        <w:outlineLvl w:val="2"/>
-      </w:pPr>
-      <w:bookmarkStart w:id="21" w:name="heading_21"/>
-      <w:r>
-        <w:rPr>
-          <w:rFonts w:ascii="Arial" w:hAnsi="Arial" w:eastAsia="等线" w:cs="Arial"/>
-          <w:b/>
-          <w:sz w:val="30"/>
-        </w:rPr>
-        <w:t>1. 零星材料采购，可未做询比价直接自行采购进场。（）</w:t>
-      </w:r>
-      <w:bookmarkEnd w:id="21"/>
-    </w:p>
-    <w:p>
-      <w:pPr>
-        <w:spacing w:before="120" w:after="120" w:line="288" w:lineRule="auto"/>
-        <w:ind w:left="0"/>
-        <w:jc w:val="left"/>
-      </w:pPr>
-      <w:r>
-        <w:rPr>
-          <w:rFonts w:ascii="Arial" w:hAnsi="Arial" w:eastAsia="等线" w:cs="Arial"/>
-          <w:b/>
-          <w:sz w:val="22"/>
-        </w:rPr>
-        <w:t>答案：×</w:t>
-      </w:r>
-      <w:r>
-        <w:rPr>
-          <w:rFonts w:ascii="Arial" w:hAnsi="Arial" w:eastAsia="等线" w:cs="Arial"/>
-          <w:sz w:val="22"/>
-        </w:rPr>
-        <w:br w:type="textWrapping"/>
-      </w:r>
-      <w:r>
-        <w:rPr>
-          <w:rFonts w:ascii="Arial" w:hAnsi="Arial" w:eastAsia="等线" w:cs="Arial"/>
-          <w:sz w:val="22"/>
-        </w:rPr>
-        <w:t>解析：零星材料采购规范②强制要求：完成询比价记录、公司审批后方可采购进场，禁止无审批私自采购。</w:t>
-      </w:r>
-    </w:p>
-    <w:p>
-      <w:pPr>
-        <w:spacing w:before="300" w:after="120" w:line="288" w:lineRule="auto"/>
-        <w:ind w:left="0"/>
-        <w:jc w:val="left"/>
-        <w:outlineLvl w:val="2"/>
-      </w:pPr>
-      <w:bookmarkStart w:id="22" w:name="heading_22"/>
-      <w:r>
-        <w:rPr>
-          <w:rFonts w:ascii="Arial" w:hAnsi="Arial" w:eastAsia="等线" w:cs="Arial"/>
-          <w:b/>
-          <w:sz w:val="30"/>
-        </w:rPr>
-        <w:t>2. 进场验收严格落实 “无采购清单不验收”，按实际进场日期办理入库。（）</w:t>
-      </w:r>
-      <w:bookmarkEnd w:id="22"/>
-    </w:p>
-    <w:p>
-      <w:pPr>
-        <w:spacing w:before="120" w:after="120" w:line="288" w:lineRule="auto"/>
-        <w:ind w:left="0"/>
-        <w:jc w:val="left"/>
-      </w:pPr>
-      <w:r>
-        <w:rPr>
-          <w:rFonts w:ascii="Arial" w:hAnsi="Arial" w:eastAsia="等线" w:cs="Arial"/>
-          <w:b/>
-          <w:sz w:val="22"/>
-        </w:rPr>
-        <w:t>答案：√</w:t>
-      </w:r>
-      <w:r>
-        <w:rPr>
-          <w:rFonts w:ascii="Arial" w:hAnsi="Arial" w:eastAsia="等线" w:cs="Arial"/>
-          <w:sz w:val="22"/>
-        </w:rPr>
-        <w:br w:type="textWrapping"/>
-      </w:r>
-      <w:r>
-        <w:rPr>
-          <w:rFonts w:ascii="Arial" w:hAnsi="Arial" w:eastAsia="等线" w:cs="Arial"/>
-          <w:sz w:val="22"/>
-        </w:rPr>
-        <w:t>解析：进场入库验收第⑦条明文规定：严禁无清单验收、禁止统一按单日批量做入库操作。</w:t>
-      </w:r>
-    </w:p>
-    <w:p>
-      <w:pPr>
-        <w:spacing w:before="300" w:after="120" w:line="288" w:lineRule="auto"/>
-        <w:ind w:left="0"/>
-        <w:jc w:val="left"/>
-        <w:outlineLvl w:val="2"/>
-      </w:pPr>
-      <w:bookmarkStart w:id="23" w:name="heading_23"/>
-      <w:r>
-        <w:rPr>
-          <w:rFonts w:ascii="Arial" w:hAnsi="Arial" w:eastAsia="等线" w:cs="Arial"/>
-          <w:b/>
-          <w:sz w:val="30"/>
-        </w:rPr>
-        <w:t>3. 自检复查环节，价检工作需要在信息价发布后的 7 个自然日内完成复核。（）</w:t>
-      </w:r>
-      <w:bookmarkEnd w:id="23"/>
-    </w:p>
-    <w:p>
-      <w:pPr>
-        <w:spacing w:before="120" w:after="120" w:line="288" w:lineRule="auto"/>
-        <w:ind w:left="0"/>
-        <w:jc w:val="left"/>
-      </w:pPr>
-      <w:r>
-        <w:rPr>
-          <w:rFonts w:ascii="Arial" w:hAnsi="Arial" w:eastAsia="等线" w:cs="Arial"/>
-          <w:b/>
-          <w:sz w:val="22"/>
-        </w:rPr>
-        <w:t>答案：×</w:t>
-      </w:r>
-      <w:r>
-        <w:rPr>
-          <w:rFonts w:ascii="Arial" w:hAnsi="Arial" w:eastAsia="等线" w:cs="Arial"/>
-          <w:sz w:val="22"/>
-        </w:rPr>
-        <w:br w:type="textWrapping"/>
-      </w:r>
-      <w:r>
-        <w:rPr>
-          <w:rFonts w:ascii="Arial" w:hAnsi="Arial" w:eastAsia="等线" w:cs="Arial"/>
-          <w:sz w:val="22"/>
-        </w:rPr>
-        <w:t>解析：自检复查标准②：价检在信息价发布后的 5 日内完成复核，不是 7 日。</w:t>
-      </w:r>
-    </w:p>
-    <w:p>
-      <w:pPr>
-        <w:spacing w:before="300" w:after="120" w:line="288" w:lineRule="auto"/>
-        <w:ind w:left="0"/>
-        <w:jc w:val="left"/>
-        <w:outlineLvl w:val="2"/>
-      </w:pPr>
-      <w:bookmarkStart w:id="24" w:name="heading_24"/>
-      <w:r>
-        <w:rPr>
-          <w:rFonts w:ascii="Arial" w:hAnsi="Arial" w:eastAsia="等线" w:cs="Arial"/>
-          <w:b/>
-          <w:sz w:val="30"/>
-        </w:rPr>
-        <w:t>4. 班组领料出库前，班组需要提前签署《领料人授权委托书》。（）</w:t>
-      </w:r>
-      <w:bookmarkEnd w:id="24"/>
-    </w:p>
-    <w:p>
-      <w:pPr>
-        <w:spacing w:before="120" w:after="120" w:line="288" w:lineRule="auto"/>
-        <w:ind w:left="0"/>
-        <w:jc w:val="left"/>
-      </w:pPr>
-      <w:r>
-        <w:rPr>
-          <w:rFonts w:ascii="Arial" w:hAnsi="Arial" w:eastAsia="等线" w:cs="Arial"/>
-          <w:b/>
-          <w:sz w:val="22"/>
-        </w:rPr>
-        <w:t>答案：√</w:t>
-      </w:r>
-      <w:r>
-        <w:rPr>
-          <w:rFonts w:ascii="Arial" w:hAnsi="Arial" w:eastAsia="等线" w:cs="Arial"/>
-          <w:sz w:val="22"/>
-        </w:rPr>
-        <w:br w:type="textWrapping"/>
-      </w:r>
-      <w:r>
-        <w:rPr>
-          <w:rFonts w:ascii="Arial" w:hAnsi="Arial" w:eastAsia="等线" w:cs="Arial"/>
-          <w:sz w:val="22"/>
-        </w:rPr>
-        <w:t>解析：班组领料授权管理要求：班组提前签署委托书，指定授权领料人员，完善签字留痕。</w:t>
-      </w:r>
-    </w:p>
-    <w:p>
-      <w:pPr>
-        <w:spacing w:before="300" w:after="120" w:line="288" w:lineRule="auto"/>
-        <w:ind w:left="0"/>
-        <w:jc w:val="left"/>
-        <w:outlineLvl w:val="2"/>
-      </w:pPr>
-      <w:bookmarkStart w:id="25" w:name="heading_25"/>
-      <w:r>
-        <w:rPr>
-          <w:rFonts w:ascii="Arial" w:hAnsi="Arial" w:eastAsia="等线" w:cs="Arial"/>
-          <w:b/>
-          <w:sz w:val="30"/>
-        </w:rPr>
-        <w:t>5. 仓库无人值守时段，大门可以虚掩，允许临时外来人员短暂进入库房。（）</w:t>
-      </w:r>
-      <w:bookmarkEnd w:id="25"/>
-    </w:p>
-    <w:p>
-      <w:pPr>
-        <w:spacing w:before="120" w:after="120" w:line="288" w:lineRule="auto"/>
-        <w:ind w:left="0"/>
-        <w:jc w:val="left"/>
-      </w:pPr>
-      <w:r>
-        <w:rPr>
-          <w:rFonts w:ascii="Arial" w:hAnsi="Arial" w:eastAsia="等线" w:cs="Arial"/>
-          <w:b/>
-          <w:sz w:val="22"/>
-        </w:rPr>
-        <w:t>答案：×</w:t>
-      </w:r>
-      <w:r>
-        <w:rPr>
-          <w:rFonts w:ascii="Arial" w:hAnsi="Arial" w:eastAsia="等线" w:cs="Arial"/>
-          <w:sz w:val="22"/>
-        </w:rPr>
-        <w:br w:type="textWrapping"/>
-      </w:r>
-      <w:r>
-        <w:rPr>
-          <w:rFonts w:ascii="Arial" w:hAnsi="Arial" w:eastAsia="等线" w:cs="Arial"/>
-          <w:sz w:val="22"/>
-        </w:rPr>
-        <w:t>解析：仓库进出人员管理规范：库房无人值守必须锁闭门窗，严禁无关人员闯入逗留。</w:t>
-      </w:r>
-    </w:p>
-    <w:p>
-      <w:pPr>
-        <w:spacing w:before="300" w:after="120" w:line="288" w:lineRule="auto"/>
-        <w:ind w:left="0"/>
-        <w:jc w:val="left"/>
-        <w:outlineLvl w:val="2"/>
-      </w:pPr>
-      <w:bookmarkStart w:id="26" w:name="heading_26"/>
-      <w:r>
-        <w:rPr>
-          <w:rFonts w:ascii="Arial" w:hAnsi="Arial" w:eastAsia="等线" w:cs="Arial"/>
-          <w:b/>
-          <w:sz w:val="30"/>
-        </w:rPr>
-        <w:t>6. 物资盘点出现账实偏差，要编制盈亏分析、由盘点责任人签字确认。（）</w:t>
-      </w:r>
-      <w:bookmarkEnd w:id="26"/>
-    </w:p>
-    <w:p>
-      <w:pPr>
-        <w:spacing w:before="120" w:after="120" w:line="288" w:lineRule="auto"/>
-        <w:ind w:left="0"/>
-        <w:jc w:val="left"/>
-      </w:pPr>
-      <w:r>
-        <w:rPr>
-          <w:rFonts w:ascii="Arial" w:hAnsi="Arial" w:eastAsia="等线" w:cs="Arial"/>
-          <w:b/>
-          <w:sz w:val="22"/>
-        </w:rPr>
-        <w:t>答案：√</w:t>
-      </w:r>
-      <w:r>
-        <w:rPr>
-          <w:rFonts w:ascii="Arial" w:hAnsi="Arial" w:eastAsia="等线" w:cs="Arial"/>
-          <w:sz w:val="22"/>
-        </w:rPr>
-        <w:br w:type="textWrapping"/>
-      </w:r>
-      <w:r>
-        <w:rPr>
-          <w:rFonts w:ascii="Arial" w:hAnsi="Arial" w:eastAsia="等线" w:cs="Arial"/>
-          <w:sz w:val="22"/>
-        </w:rPr>
-        <w:t>解析：仓库材料盘点细则③：盘点盈亏编制分析文件，盘点责任人签字存档复盘。</w:t>
-      </w:r>
-    </w:p>
-    <w:p>
-      <w:pPr>
-        <w:spacing w:before="300" w:after="120" w:line="288" w:lineRule="auto"/>
-        <w:ind w:left="0"/>
-        <w:jc w:val="left"/>
-        <w:outlineLvl w:val="2"/>
-      </w:pPr>
-      <w:bookmarkStart w:id="27" w:name="heading_27"/>
-      <w:r>
-        <w:rPr>
-          <w:rFonts w:ascii="Arial" w:hAnsi="Arial" w:eastAsia="等线" w:cs="Arial"/>
-          <w:b/>
-          <w:sz w:val="30"/>
-        </w:rPr>
-        <w:t>7. 物资调拨进场后 1 天内需完成核量，按节点开展价检核算。（）</w:t>
-      </w:r>
-      <w:bookmarkEnd w:id="27"/>
-    </w:p>
-    <w:p>
-      <w:pPr>
-        <w:spacing w:before="120" w:after="120" w:line="288" w:lineRule="auto"/>
-        <w:ind w:left="0"/>
-        <w:jc w:val="left"/>
-      </w:pPr>
-      <w:r>
-        <w:rPr>
-          <w:rFonts w:ascii="Arial" w:hAnsi="Arial" w:eastAsia="等线" w:cs="Arial"/>
-          <w:b/>
-          <w:sz w:val="22"/>
-        </w:rPr>
-        <w:t>答案：√</w:t>
-      </w:r>
-      <w:r>
-        <w:rPr>
-          <w:rFonts w:ascii="Arial" w:hAnsi="Arial" w:eastAsia="等线" w:cs="Arial"/>
-          <w:sz w:val="22"/>
-        </w:rPr>
-        <w:br w:type="textWrapping"/>
-      </w:r>
-      <w:r>
-        <w:rPr>
-          <w:rFonts w:ascii="Arial" w:hAnsi="Arial" w:eastAsia="等线" w:cs="Arial"/>
-          <w:sz w:val="22"/>
-        </w:rPr>
-        <w:t>解析：调拨管理标准②：调拨物资入库上传平台，调拨完成 1 天内完成核量、价检工作。</w:t>
-      </w:r>
-    </w:p>
-    <w:p>
-      <w:pPr>
-        <w:spacing w:before="300" w:after="120" w:line="288" w:lineRule="auto"/>
-        <w:ind w:left="0"/>
-        <w:jc w:val="left"/>
-        <w:outlineLvl w:val="2"/>
-      </w:pPr>
-      <w:bookmarkStart w:id="28" w:name="heading_28"/>
-      <w:r>
-        <w:rPr>
-          <w:rFonts w:ascii="Arial" w:hAnsi="Arial" w:eastAsia="等线" w:cs="Arial"/>
-          <w:b/>
-          <w:sz w:val="30"/>
-        </w:rPr>
-        <w:t>8. 目标成本编制完成后，无需定期复盘主材用量、不用预警材料超量风险。（）</w:t>
-      </w:r>
-      <w:bookmarkEnd w:id="28"/>
-    </w:p>
-    <w:p>
-      <w:pPr>
-        <w:spacing w:before="120" w:after="120" w:line="288" w:lineRule="auto"/>
-        <w:ind w:left="0"/>
-        <w:jc w:val="left"/>
-      </w:pPr>
-      <w:r>
-        <w:rPr>
-          <w:rFonts w:ascii="Arial" w:hAnsi="Arial" w:eastAsia="等线" w:cs="Arial"/>
-          <w:b/>
-          <w:sz w:val="22"/>
-        </w:rPr>
-        <w:t>答案：×</w:t>
-      </w:r>
-      <w:r>
-        <w:rPr>
-          <w:rFonts w:ascii="Arial" w:hAnsi="Arial" w:eastAsia="等线" w:cs="Arial"/>
-          <w:sz w:val="22"/>
-        </w:rPr>
-        <w:br w:type="textWrapping"/>
-      </w:r>
-      <w:r>
-        <w:rPr>
-          <w:rFonts w:ascii="Arial" w:hAnsi="Arial" w:eastAsia="等线" w:cs="Arial"/>
-          <w:sz w:val="22"/>
-        </w:rPr>
-        <w:t>解析：用量跟踪及分析要求：定期统计主材耗用，识别用量异常，做超量预警、成因分析。</w:t>
-      </w:r>
-    </w:p>
-    <w:p>
-      <w:pPr>
-        <w:spacing w:before="300" w:after="120" w:line="288" w:lineRule="auto"/>
-        <w:ind w:left="0"/>
-        <w:jc w:val="left"/>
-        <w:outlineLvl w:val="2"/>
-      </w:pPr>
-      <w:bookmarkStart w:id="29" w:name="heading_29"/>
-      <w:r>
-        <w:rPr>
-          <w:rFonts w:ascii="Arial" w:hAnsi="Arial" w:eastAsia="等线" w:cs="Arial"/>
-          <w:b/>
-          <w:sz w:val="30"/>
-        </w:rPr>
-        <w:t>9. 供应商能力评价维度包含供货质量、交付及时性、结算配合度、垫资能力。（）</w:t>
-      </w:r>
-      <w:bookmarkEnd w:id="29"/>
-    </w:p>
-    <w:p>
-      <w:pPr>
-        <w:spacing w:before="120" w:after="120" w:line="288" w:lineRule="auto"/>
-        <w:ind w:left="0"/>
-        <w:jc w:val="left"/>
-      </w:pPr>
-      <w:r>
-        <w:rPr>
-          <w:rFonts w:ascii="Arial" w:hAnsi="Arial" w:eastAsia="等线" w:cs="Arial"/>
-          <w:b/>
-          <w:sz w:val="22"/>
-        </w:rPr>
-        <w:t>答案：√</w:t>
-      </w:r>
-      <w:r>
-        <w:rPr>
-          <w:rFonts w:ascii="Arial" w:hAnsi="Arial" w:eastAsia="等线" w:cs="Arial"/>
-          <w:sz w:val="22"/>
-        </w:rPr>
-        <w:br w:type="textWrapping"/>
-      </w:r>
-      <w:r>
-        <w:rPr>
-          <w:rFonts w:ascii="Arial" w:hAnsi="Arial" w:eastAsia="等线" w:cs="Arial"/>
-          <w:sz w:val="22"/>
-        </w:rPr>
-        <w:t>解析：供应商能力评价条目：按照供方多维度指标（质量、时效、结算配合、垫资水平）做供方评级。</w:t>
-      </w:r>
-    </w:p>
-    <w:p>
-      <w:pPr>
-        <w:spacing w:before="300" w:after="120" w:line="288" w:lineRule="auto"/>
-        <w:ind w:left="0"/>
-        <w:jc w:val="left"/>
-        <w:outlineLvl w:val="2"/>
-      </w:pPr>
-      <w:bookmarkStart w:id="30" w:name="heading_30"/>
-      <w:r>
-        <w:rPr>
-          <w:rFonts w:ascii="Arial" w:hAnsi="Arial" w:eastAsia="等线" w:cs="Arial"/>
-          <w:b/>
-          <w:sz w:val="30"/>
-        </w:rPr>
-        <w:t>10. 现场可随意降级处置不合格物料，不用做书面备注、影像留痕。（）</w:t>
-      </w:r>
-      <w:bookmarkEnd w:id="30"/>
-    </w:p>
-    <w:p>
-      <w:pPr>
-        <w:spacing w:before="120" w:after="120" w:line="288" w:lineRule="auto"/>
-        <w:ind w:left="0"/>
-        <w:jc w:val="left"/>
-      </w:pPr>
-      <w:r>
-        <w:rPr>
-          <w:rFonts w:ascii="Arial" w:hAnsi="Arial" w:eastAsia="等线" w:cs="Arial"/>
-          <w:b/>
-          <w:sz w:val="22"/>
-        </w:rPr>
-        <w:t>答案：×</w:t>
-      </w:r>
-      <w:r>
-        <w:rPr>
-          <w:rFonts w:ascii="Arial" w:hAnsi="Arial" w:eastAsia="等线" w:cs="Arial"/>
-          <w:sz w:val="22"/>
-        </w:rPr>
-        <w:br w:type="textWrapping"/>
-      </w:r>
-      <w:r>
-        <w:rPr>
-          <w:rFonts w:ascii="Arial" w:hAnsi="Arial" w:eastAsia="等线" w:cs="Arial"/>
-          <w:sz w:val="22"/>
-        </w:rPr>
-        <w:t>解析：不合格物料降级、退货全流程，强制要求单据备注事由 + 全过程影像留痕备查。</w:t>
-      </w:r>
-    </w:p>
-    <w:p>
-      <w:pPr>
-        <w:spacing w:before="120" w:after="120" w:line="288" w:lineRule="auto"/>
-        <w:ind w:left="0"/>
-        <w:jc w:val="left"/>
-      </w:pPr>
       <w:bookmarkStart w:id="31" w:name="_GoBack"/>
       <w:bookmarkEnd w:id="31"/>
+    </w:p>
+    <w:p>
+      <w:pPr>
+        <w:spacing w:before="300" w:after="120" w:line="288" w:lineRule="auto"/>
+        <w:ind w:left="0"/>
+        <w:jc w:val="left"/>
+        <w:outlineLvl w:val="2"/>
+      </w:pPr>
+      <w:bookmarkStart w:id="21" w:name="heading_21"/>
+      <w:r>
+        <w:rPr>
+          <w:rFonts w:ascii="Arial" w:hAnsi="Arial" w:eastAsia="等线" w:cs="Arial"/>
+          <w:b/>
+          <w:sz w:val="30"/>
+        </w:rPr>
+        <w:t>1. 零星材料采购，可未做询比价直接自行采购进场。（）</w:t>
+      </w:r>
+      <w:bookmarkEnd w:id="21"/>
+    </w:p>
+    <w:p>
+      <w:pPr>
+        <w:spacing w:before="120" w:after="120" w:line="288" w:lineRule="auto"/>
+        <w:ind w:left="0"/>
+        <w:jc w:val="left"/>
+      </w:pPr>
+      <w:r>
+        <w:rPr>
+          <w:rFonts w:ascii="Arial" w:hAnsi="Arial" w:eastAsia="等线" w:cs="Arial"/>
+          <w:b/>
+          <w:sz w:val="22"/>
+        </w:rPr>
+        <w:t>答案：×</w:t>
+      </w:r>
+      <w:r>
+        <w:rPr>
+          <w:rFonts w:ascii="Arial" w:hAnsi="Arial" w:eastAsia="等线" w:cs="Arial"/>
+          <w:sz w:val="22"/>
+        </w:rPr>
+        <w:br w:type="textWrapping"/>
+      </w:r>
+      <w:r>
+        <w:rPr>
+          <w:rFonts w:ascii="Arial" w:hAnsi="Arial" w:eastAsia="等线" w:cs="Arial"/>
+          <w:sz w:val="22"/>
+        </w:rPr>
+        <w:t>解析：零星材料采购规范②强制要求：完成询比价记录、公司审批后方可采购进场，禁止无审批私自采购。</w:t>
+      </w:r>
+    </w:p>
+    <w:p>
+      <w:pPr>
+        <w:spacing w:before="300" w:after="120" w:line="288" w:lineRule="auto"/>
+        <w:ind w:left="0"/>
+        <w:jc w:val="left"/>
+        <w:outlineLvl w:val="2"/>
+      </w:pPr>
+      <w:bookmarkStart w:id="22" w:name="heading_22"/>
+      <w:r>
+        <w:rPr>
+          <w:rFonts w:ascii="Arial" w:hAnsi="Arial" w:eastAsia="等线" w:cs="Arial"/>
+          <w:b/>
+          <w:sz w:val="30"/>
+        </w:rPr>
+        <w:t>2. 进场验收严格落实 “无采购清单不验收”，按实际进场日期办理入库。（）</w:t>
+      </w:r>
+      <w:bookmarkEnd w:id="22"/>
+    </w:p>
+    <w:p>
+      <w:pPr>
+        <w:spacing w:before="120" w:after="120" w:line="288" w:lineRule="auto"/>
+        <w:ind w:left="0"/>
+        <w:jc w:val="left"/>
+      </w:pPr>
+      <w:r>
+        <w:rPr>
+          <w:rFonts w:ascii="Arial" w:hAnsi="Arial" w:eastAsia="等线" w:cs="Arial"/>
+          <w:b/>
+          <w:sz w:val="22"/>
+        </w:rPr>
+        <w:t>答案：√</w:t>
+      </w:r>
+      <w:r>
+        <w:rPr>
+          <w:rFonts w:ascii="Arial" w:hAnsi="Arial" w:eastAsia="等线" w:cs="Arial"/>
+          <w:sz w:val="22"/>
+        </w:rPr>
+        <w:br w:type="textWrapping"/>
+      </w:r>
+      <w:r>
+        <w:rPr>
+          <w:rFonts w:ascii="Arial" w:hAnsi="Arial" w:eastAsia="等线" w:cs="Arial"/>
+          <w:sz w:val="22"/>
+        </w:rPr>
+        <w:t>解析：进场入库验收第⑦条明文规定：严禁无清单验收、禁止统一按单日批量做入库操作。</w:t>
+      </w:r>
+    </w:p>
+    <w:p>
+      <w:pPr>
+        <w:spacing w:before="300" w:after="120" w:line="288" w:lineRule="auto"/>
+        <w:ind w:left="0"/>
+        <w:jc w:val="left"/>
+        <w:outlineLvl w:val="2"/>
+      </w:pPr>
+      <w:bookmarkStart w:id="23" w:name="heading_23"/>
+      <w:r>
+        <w:rPr>
+          <w:rFonts w:ascii="Arial" w:hAnsi="Arial" w:eastAsia="等线" w:cs="Arial"/>
+          <w:b/>
+          <w:sz w:val="30"/>
+        </w:rPr>
+        <w:t>3. 自检复查环节，价检工作需要在信息价发布后的 7 个自然日内完成复核。（）</w:t>
+      </w:r>
+      <w:bookmarkEnd w:id="23"/>
+    </w:p>
+    <w:p>
+      <w:pPr>
+        <w:spacing w:before="120" w:after="120" w:line="288" w:lineRule="auto"/>
+        <w:ind w:left="0"/>
+        <w:jc w:val="left"/>
+      </w:pPr>
+      <w:r>
+        <w:rPr>
+          <w:rFonts w:ascii="Arial" w:hAnsi="Arial" w:eastAsia="等线" w:cs="Arial"/>
+          <w:b/>
+          <w:sz w:val="22"/>
+        </w:rPr>
+        <w:t>答案：×</w:t>
+      </w:r>
+      <w:r>
+        <w:rPr>
+          <w:rFonts w:ascii="Arial" w:hAnsi="Arial" w:eastAsia="等线" w:cs="Arial"/>
+          <w:sz w:val="22"/>
+        </w:rPr>
+        <w:br w:type="textWrapping"/>
+      </w:r>
+      <w:r>
+        <w:rPr>
+          <w:rFonts w:ascii="Arial" w:hAnsi="Arial" w:eastAsia="等线" w:cs="Arial"/>
+          <w:sz w:val="22"/>
+        </w:rPr>
+        <w:t>解析：自检复查标准②：价检在信息价发布后的 5 日内完成复核，不是 7 日。</w:t>
+      </w:r>
+    </w:p>
+    <w:p>
+      <w:pPr>
+        <w:spacing w:before="300" w:after="120" w:line="288" w:lineRule="auto"/>
+        <w:ind w:left="0"/>
+        <w:jc w:val="left"/>
+        <w:outlineLvl w:val="2"/>
+      </w:pPr>
+      <w:bookmarkStart w:id="24" w:name="heading_24"/>
+      <w:r>
+        <w:rPr>
+          <w:rFonts w:ascii="Arial" w:hAnsi="Arial" w:eastAsia="等线" w:cs="Arial"/>
+          <w:b/>
+          <w:sz w:val="30"/>
+        </w:rPr>
+        <w:t>4. 班组领料出库前，班组需要提前签署《领料人授权委托书》。（）</w:t>
+      </w:r>
+      <w:bookmarkEnd w:id="24"/>
+    </w:p>
+    <w:p>
+      <w:pPr>
+        <w:spacing w:before="120" w:after="120" w:line="288" w:lineRule="auto"/>
+        <w:ind w:left="0"/>
+        <w:jc w:val="left"/>
+      </w:pPr>
+      <w:r>
+        <w:rPr>
+          <w:rFonts w:ascii="Arial" w:hAnsi="Arial" w:eastAsia="等线" w:cs="Arial"/>
+          <w:b/>
+          <w:sz w:val="22"/>
+        </w:rPr>
+        <w:t>答案：√</w:t>
+      </w:r>
+      <w:r>
+        <w:rPr>
+          <w:rFonts w:ascii="Arial" w:hAnsi="Arial" w:eastAsia="等线" w:cs="Arial"/>
+          <w:sz w:val="22"/>
+        </w:rPr>
+        <w:br w:type="textWrapping"/>
+      </w:r>
+      <w:r>
+        <w:rPr>
+          <w:rFonts w:ascii="Arial" w:hAnsi="Arial" w:eastAsia="等线" w:cs="Arial"/>
+          <w:sz w:val="22"/>
+        </w:rPr>
+        <w:t>解析：班组领料授权管理要求：班组提前签署委托书，指定授权领料人员，完善签字留痕。</w:t>
+      </w:r>
+    </w:p>
+    <w:p>
+      <w:pPr>
+        <w:spacing w:before="300" w:after="120" w:line="288" w:lineRule="auto"/>
+        <w:ind w:left="0"/>
+        <w:jc w:val="left"/>
+        <w:outlineLvl w:val="2"/>
+      </w:pPr>
+      <w:bookmarkStart w:id="25" w:name="heading_25"/>
+      <w:r>
+        <w:rPr>
+          <w:rFonts w:ascii="Arial" w:hAnsi="Arial" w:eastAsia="等线" w:cs="Arial"/>
+          <w:b/>
+          <w:sz w:val="30"/>
+        </w:rPr>
+        <w:t>5. 仓库无人值守时段，大门可以虚掩，允许临时外来人员短暂进入库房。（）</w:t>
+      </w:r>
+      <w:bookmarkEnd w:id="25"/>
+    </w:p>
+    <w:p>
+      <w:pPr>
+        <w:spacing w:before="120" w:after="120" w:line="288" w:lineRule="auto"/>
+        <w:ind w:left="0"/>
+        <w:jc w:val="left"/>
+      </w:pPr>
+      <w:r>
+        <w:rPr>
+          <w:rFonts w:ascii="Arial" w:hAnsi="Arial" w:eastAsia="等线" w:cs="Arial"/>
+          <w:b/>
+          <w:sz w:val="22"/>
+        </w:rPr>
+        <w:t>答案：×</w:t>
+      </w:r>
+      <w:r>
+        <w:rPr>
+          <w:rFonts w:ascii="Arial" w:hAnsi="Arial" w:eastAsia="等线" w:cs="Arial"/>
+          <w:sz w:val="22"/>
+        </w:rPr>
+        <w:br w:type="textWrapping"/>
+      </w:r>
+      <w:r>
+        <w:rPr>
+          <w:rFonts w:ascii="Arial" w:hAnsi="Arial" w:eastAsia="等线" w:cs="Arial"/>
+          <w:sz w:val="22"/>
+        </w:rPr>
+        <w:t>解析：仓库进出人员管理规范：库房无人值守必须锁闭门窗，严禁无关人员闯入逗留。</w:t>
+      </w:r>
+    </w:p>
+    <w:p>
+      <w:pPr>
+        <w:spacing w:before="300" w:after="120" w:line="288" w:lineRule="auto"/>
+        <w:ind w:left="0"/>
+        <w:jc w:val="left"/>
+        <w:outlineLvl w:val="2"/>
+      </w:pPr>
+      <w:bookmarkStart w:id="26" w:name="heading_26"/>
+      <w:r>
+        <w:rPr>
+          <w:rFonts w:ascii="Arial" w:hAnsi="Arial" w:eastAsia="等线" w:cs="Arial"/>
+          <w:b/>
+          <w:sz w:val="30"/>
+        </w:rPr>
+        <w:t>6. 物资盘点出现账实偏差，要编制盈亏分析、由盘点责任人签字确认。（）</w:t>
+      </w:r>
+      <w:bookmarkEnd w:id="26"/>
+    </w:p>
+    <w:p>
+      <w:pPr>
+        <w:spacing w:before="120" w:after="120" w:line="288" w:lineRule="auto"/>
+        <w:ind w:left="0"/>
+        <w:jc w:val="left"/>
+      </w:pPr>
+      <w:r>
+        <w:rPr>
+          <w:rFonts w:ascii="Arial" w:hAnsi="Arial" w:eastAsia="等线" w:cs="Arial"/>
+          <w:b/>
+          <w:sz w:val="22"/>
+        </w:rPr>
+        <w:t>答案：√</w:t>
+      </w:r>
+      <w:r>
+        <w:rPr>
+          <w:rFonts w:ascii="Arial" w:hAnsi="Arial" w:eastAsia="等线" w:cs="Arial"/>
+          <w:sz w:val="22"/>
+        </w:rPr>
+        <w:br w:type="textWrapping"/>
+      </w:r>
+      <w:r>
+        <w:rPr>
+          <w:rFonts w:ascii="Arial" w:hAnsi="Arial" w:eastAsia="等线" w:cs="Arial"/>
+          <w:sz w:val="22"/>
+        </w:rPr>
+        <w:t>解析：仓库材料盘点细则③：盘点盈亏编制分析文件，盘点责任人签字存档复盘。</w:t>
+      </w:r>
+    </w:p>
+    <w:p>
+      <w:pPr>
+        <w:spacing w:before="300" w:after="120" w:line="288" w:lineRule="auto"/>
+        <w:ind w:left="0"/>
+        <w:jc w:val="left"/>
+        <w:outlineLvl w:val="2"/>
+      </w:pPr>
+      <w:bookmarkStart w:id="27" w:name="heading_27"/>
+      <w:r>
+        <w:rPr>
+          <w:rFonts w:ascii="Arial" w:hAnsi="Arial" w:eastAsia="等线" w:cs="Arial"/>
+          <w:b/>
+          <w:sz w:val="30"/>
+        </w:rPr>
+        <w:t>7. 物资调拨进场后 1 天内需完成核量，按节点开展价检核算。（）</w:t>
+      </w:r>
+      <w:bookmarkEnd w:id="27"/>
+    </w:p>
+    <w:p>
+      <w:pPr>
+        <w:spacing w:before="120" w:after="120" w:line="288" w:lineRule="auto"/>
+        <w:ind w:left="0"/>
+        <w:jc w:val="left"/>
+      </w:pPr>
+      <w:r>
+        <w:rPr>
+          <w:rFonts w:ascii="Arial" w:hAnsi="Arial" w:eastAsia="等线" w:cs="Arial"/>
+          <w:b/>
+          <w:sz w:val="22"/>
+        </w:rPr>
+        <w:t>答案：√</w:t>
+      </w:r>
+      <w:r>
+        <w:rPr>
+          <w:rFonts w:ascii="Arial" w:hAnsi="Arial" w:eastAsia="等线" w:cs="Arial"/>
+          <w:sz w:val="22"/>
+        </w:rPr>
+        <w:br w:type="textWrapping"/>
+      </w:r>
+      <w:r>
+        <w:rPr>
+          <w:rFonts w:ascii="Arial" w:hAnsi="Arial" w:eastAsia="等线" w:cs="Arial"/>
+          <w:sz w:val="22"/>
+        </w:rPr>
+        <w:t>解析：调拨管理标准②：调拨物资入库上传平台，调拨完成 1 天内完成核量、价检工作。</w:t>
+      </w:r>
+    </w:p>
+    <w:p>
+      <w:pPr>
+        <w:spacing w:before="300" w:after="120" w:line="288" w:lineRule="auto"/>
+        <w:ind w:left="0"/>
+        <w:jc w:val="left"/>
+        <w:outlineLvl w:val="2"/>
+      </w:pPr>
+      <w:bookmarkStart w:id="28" w:name="heading_28"/>
+      <w:r>
+        <w:rPr>
+          <w:rFonts w:ascii="Arial" w:hAnsi="Arial" w:eastAsia="等线" w:cs="Arial"/>
+          <w:b/>
+          <w:sz w:val="30"/>
+        </w:rPr>
+        <w:t>8. 目标成本编制完成后，无需定期复盘主材用量、不用预警材料超量风险。（）</w:t>
+      </w:r>
+      <w:bookmarkEnd w:id="28"/>
+    </w:p>
+    <w:p>
+      <w:pPr>
+        <w:spacing w:before="120" w:after="120" w:line="288" w:lineRule="auto"/>
+        <w:ind w:left="0"/>
+        <w:jc w:val="left"/>
+      </w:pPr>
+      <w:r>
+        <w:rPr>
+          <w:rFonts w:ascii="Arial" w:hAnsi="Arial" w:eastAsia="等线" w:cs="Arial"/>
+          <w:b/>
+          <w:sz w:val="22"/>
+        </w:rPr>
+        <w:t>答案：×</w:t>
+      </w:r>
+      <w:r>
+        <w:rPr>
+          <w:rFonts w:ascii="Arial" w:hAnsi="Arial" w:eastAsia="等线" w:cs="Arial"/>
+          <w:sz w:val="22"/>
+        </w:rPr>
+        <w:br w:type="textWrapping"/>
+      </w:r>
+      <w:r>
+        <w:rPr>
+          <w:rFonts w:ascii="Arial" w:hAnsi="Arial" w:eastAsia="等线" w:cs="Arial"/>
+          <w:sz w:val="22"/>
+        </w:rPr>
+        <w:t>解析：用量跟踪及分析要求：定期统计主材耗用，识别用量异常，做超量预警、成因分析。</w:t>
+      </w:r>
+    </w:p>
+    <w:p>
+      <w:pPr>
+        <w:spacing w:before="300" w:after="120" w:line="288" w:lineRule="auto"/>
+        <w:ind w:left="0"/>
+        <w:jc w:val="left"/>
+        <w:outlineLvl w:val="2"/>
+      </w:pPr>
+      <w:bookmarkStart w:id="29" w:name="heading_29"/>
+      <w:r>
+        <w:rPr>
+          <w:rFonts w:ascii="Arial" w:hAnsi="Arial" w:eastAsia="等线" w:cs="Arial"/>
+          <w:b/>
+          <w:sz w:val="30"/>
+        </w:rPr>
+        <w:t>9. 供应商能力评价维度包含供货质量、交付及时性、结算配合度、垫资能力。（）</w:t>
+      </w:r>
+      <w:bookmarkEnd w:id="29"/>
+    </w:p>
+    <w:p>
+      <w:pPr>
+        <w:spacing w:before="120" w:after="120" w:line="288" w:lineRule="auto"/>
+        <w:ind w:left="0"/>
+        <w:jc w:val="left"/>
+      </w:pPr>
+      <w:r>
+        <w:rPr>
+          <w:rFonts w:ascii="Arial" w:hAnsi="Arial" w:eastAsia="等线" w:cs="Arial"/>
+          <w:b/>
+          <w:sz w:val="22"/>
+        </w:rPr>
+        <w:t>答案：√</w:t>
+      </w:r>
+      <w:r>
+        <w:rPr>
+          <w:rFonts w:ascii="Arial" w:hAnsi="Arial" w:eastAsia="等线" w:cs="Arial"/>
+          <w:sz w:val="22"/>
+        </w:rPr>
+        <w:br w:type="textWrapping"/>
+      </w:r>
+      <w:r>
+        <w:rPr>
+          <w:rFonts w:ascii="Arial" w:hAnsi="Arial" w:eastAsia="等线" w:cs="Arial"/>
+          <w:sz w:val="22"/>
+        </w:rPr>
+        <w:t>解析：供应商能力评价条目：按照供方多维度指标（质量、时效、结算配合、垫资水平）做供方评级。</w:t>
+      </w:r>
+    </w:p>
+    <w:p>
+      <w:pPr>
+        <w:spacing w:before="300" w:after="120" w:line="288" w:lineRule="auto"/>
+        <w:ind w:left="0"/>
+        <w:jc w:val="left"/>
+        <w:outlineLvl w:val="2"/>
+      </w:pPr>
+      <w:bookmarkStart w:id="30" w:name="heading_30"/>
+      <w:r>
+        <w:rPr>
+          <w:rFonts w:ascii="Arial" w:hAnsi="Arial" w:eastAsia="等线" w:cs="Arial"/>
+          <w:b/>
+          <w:sz w:val="30"/>
+        </w:rPr>
+        <w:t>10. 现场可随意降级处置不合格物料，不用做书面备注、影像留痕。（）</w:t>
+      </w:r>
+      <w:bookmarkEnd w:id="30"/>
+    </w:p>
+    <w:p>
+      <w:pPr>
+        <w:spacing w:before="120" w:after="120" w:line="288" w:lineRule="auto"/>
+        <w:ind w:left="0"/>
+        <w:jc w:val="left"/>
+      </w:pPr>
+      <w:r>
+        <w:rPr>
+          <w:rFonts w:ascii="Arial" w:hAnsi="Arial" w:eastAsia="等线" w:cs="Arial"/>
+          <w:b/>
+          <w:sz w:val="22"/>
+        </w:rPr>
+        <w:t>答案：×</w:t>
+      </w:r>
+      <w:r>
+        <w:rPr>
+          <w:rFonts w:ascii="Arial" w:hAnsi="Arial" w:eastAsia="等线" w:cs="Arial"/>
+          <w:sz w:val="22"/>
+        </w:rPr>
+        <w:br w:type="textWrapping"/>
+      </w:r>
+      <w:r>
+        <w:rPr>
+          <w:rFonts w:ascii="Arial" w:hAnsi="Arial" w:eastAsia="等线" w:cs="Arial"/>
+          <w:sz w:val="22"/>
+        </w:rPr>
+        <w:t>解析：不合格物料降级、退货全流程，强制要求单据备注事由 + 全过程影像留痕备查。</w:t>
+      </w:r>
+    </w:p>
+    <w:p>
+      <w:pPr>
+        <w:spacing w:before="120" w:after="120" w:line="288" w:lineRule="auto"/>
+        <w:ind w:left="0"/>
+        <w:jc w:val="left"/>
+      </w:pPr>
     </w:p>
     <w:sectPr>
       <w:headerReference r:id="rId3" w:type="default"/>
@@ -2694,6 +3039,7 @@
       <w:jc w:val="both"/>
     </w:pPr>
     <w:rPr>
+      <w:rFonts w:asciiTheme="minorHAnsi" w:hAnsiTheme="minorHAnsi" w:eastAsiaTheme="minorEastAsia" w:cstheme="minorBidi"/>
       <w:sz w:val="21"/>
       <w:szCs w:val="22"/>
     </w:rPr>

</xml_diff>